<commit_message>
Clean up bulletin pipeline and standardize final output
</commit_message>
<xml_diff>
--- a/IMD_Nowcast_Bulletin.docx
+++ b/IMD_Nowcast_Bulletin.docx
@@ -200,7 +200,7 @@
       <w:r>
         <w:drawing>
           <wp:inline xmlns:a="http://schemas.openxmlformats.org/drawingml/2006/main" xmlns:pic="http://schemas.openxmlformats.org/drawingml/2006/picture">
-            <wp:extent cx="6492240" cy="3182471"/>
+            <wp:extent cx="6492240" cy="4463415"/>
             <wp:docPr id="1" name="Picture 1"/>
             <wp:cNvGraphicFramePr>
               <a:graphicFrameLocks noChangeAspect="1"/>
@@ -209,7 +209,7 @@
               <a:graphicData uri="http://schemas.openxmlformats.org/drawingml/2006/picture">
                 <pic:pic>
                   <pic:nvPicPr>
-                    <pic:cNvPr id="0" name="integrated_bulletin.png"/>
+                    <pic:cNvPr id="0" name="final_bulletin.png"/>
                     <pic:cNvPicPr/>
                   </pic:nvPicPr>
                   <pic:blipFill>
@@ -221,7 +221,7 @@
                   <pic:spPr>
                     <a:xfrm>
                       <a:off x="0" y="0"/>
-                      <a:ext cx="6492240" cy="3182471"/>
+                      <a:ext cx="6492240" cy="4463415"/>
                     </a:xfrm>
                     <a:prstGeom prst="rect"/>
                   </pic:spPr>

</xml_diff>

<commit_message>
Complete nowcast bulletin generation and warning map integration
# Conflicts:
#	IMD_Nowcast_Bulletin.docx
#	generate_bulletin.py
</commit_message>
<xml_diff>
--- a/IMD_Nowcast_Bulletin.docx
+++ b/IMD_Nowcast_Bulletin.docx
@@ -4,203 +4,13 @@
   <w:body>
     <w:p>
       <w:pPr>
-        <w:spacing w:before="120" w:after="40"/>
-        <w:jc w:val="center"/>
-      </w:pPr>
-      <w:r>
-        <w:rPr>
-          <w:rFonts w:ascii="Arial" w:hAnsi="Arial"/>
-          <w:b/>
-          <w:color w:val="0C2F52"/>
-          <w:sz w:val="48"/>
-        </w:rPr>
-        <w:t>NOWCAST BULLETIN</w:t>
-      </w:r>
-    </w:p>
-    <w:p>
-      <w:pPr>
-        <w:spacing w:after="240"/>
-        <w:jc w:val="center"/>
-      </w:pPr>
-      <w:r>
-        <w:rPr>
-          <w:rFonts w:ascii="Arial" w:hAnsi="Arial"/>
-          <w:b/>
-          <w:color w:val="205B91"/>
-          <w:sz w:val="30"/>
-        </w:rPr>
-        <w:t>TELANGANA</w:t>
-      </w:r>
-    </w:p>
-    <w:tbl>
-      <w:tblPr>
-        <w:tblW w:type="auto" w:w="0"/>
-        <w:tblLayout w:type="fixed"/>
-        <w:tblLook w:firstColumn="1" w:firstRow="1" w:lastColumn="0" w:lastRow="0" w:noHBand="0" w:noVBand="1" w:val="04A0"/>
-      </w:tblPr>
-      <w:tblGrid>
-        <w:gridCol w:w="3240"/>
-        <w:gridCol w:w="3240"/>
-        <w:gridCol w:w="3240"/>
-      </w:tblGrid>
-      <w:tr>
-        <w:tc>
-          <w:tcPr>
-            <w:tcW w:type="dxa" w:w="3408"/>
-            <w:shd w:fill="EBF3FA"/>
-            <w:tcBorders>
-              <w:top w:val="single" w:sz="8" w:color="205B91"/>
-              <w:left w:val="single" w:sz="8" w:color="205B91"/>
-              <w:bottom w:val="single" w:sz="8" w:color="205B91"/>
-              <w:right w:val="single" w:sz="8" w:color="205B91"/>
-              <w:insideH w:val="single" w:sz="8" w:color="205B91"/>
-              <w:insideV w:val="single" w:sz="8" w:color="205B91"/>
-            </w:tcBorders>
-            <w:tcMar>
-              <w:top w:w="100" w:type="dxa"/>
-              <w:start w:w="140" w:type="dxa"/>
-              <w:bottom w:w="100" w:type="dxa"/>
-              <w:end w:w="140" w:type="dxa"/>
-            </w:tcMar>
-            <w:vAlign w:val="center"/>
-          </w:tcPr>
-          <w:p>
-            <w:pPr>
-              <w:spacing w:after="40"/>
-              <w:jc w:val="center"/>
-            </w:pPr>
-            <w:r/>
-            <w:r>
-              <w:rPr>
-                <w:rFonts w:ascii="Arial" w:hAnsi="Arial"/>
-                <w:b/>
-                <w:color w:val="205B91"/>
-                <w:sz w:val="17"/>
-              </w:rPr>
-              <w:t>BULLETIN DATE</w:t>
-              <w:br/>
-            </w:r>
-            <w:r>
-              <w:rPr>
-                <w:rFonts w:ascii="Arial" w:hAnsi="Arial"/>
-                <w:b/>
-                <w:color w:val="243445"/>
-                <w:sz w:val="22"/>
-              </w:rPr>
-              <w:t>2026-09-21</w:t>
-            </w:r>
-          </w:p>
-        </w:tc>
-        <w:tc>
-          <w:tcPr>
-            <w:tcW w:type="dxa" w:w="3408"/>
-            <w:shd w:fill="EBF3FA"/>
-            <w:tcBorders>
-              <w:top w:val="single" w:sz="8" w:color="205B91"/>
-              <w:left w:val="single" w:sz="8" w:color="205B91"/>
-              <w:bottom w:val="single" w:sz="8" w:color="205B91"/>
-              <w:right w:val="single" w:sz="8" w:color="205B91"/>
-              <w:insideH w:val="single" w:sz="8" w:color="205B91"/>
-              <w:insideV w:val="single" w:sz="8" w:color="205B91"/>
-            </w:tcBorders>
-            <w:tcMar>
-              <w:top w:w="100" w:type="dxa"/>
-              <w:start w:w="140" w:type="dxa"/>
-              <w:bottom w:w="100" w:type="dxa"/>
-              <w:end w:w="140" w:type="dxa"/>
-            </w:tcMar>
-            <w:vAlign w:val="center"/>
-          </w:tcPr>
-          <w:p>
-            <w:pPr>
-              <w:spacing w:after="40"/>
-              <w:jc w:val="center"/>
-            </w:pPr>
-            <w:r/>
-            <w:r>
-              <w:rPr>
-                <w:rFonts w:ascii="Arial" w:hAnsi="Arial"/>
-                <w:b/>
-                <w:color w:val="205B91"/>
-                <w:sz w:val="17"/>
-              </w:rPr>
-              <w:t>TIME OF ISSUE</w:t>
-              <w:br/>
-            </w:r>
-            <w:r>
-              <w:rPr>
-                <w:rFonts w:ascii="Arial" w:hAnsi="Arial"/>
-                <w:b/>
-                <w:color w:val="243445"/>
-                <w:sz w:val="22"/>
-              </w:rPr>
-              <w:t>19:17:50</w:t>
-            </w:r>
-          </w:p>
-        </w:tc>
-        <w:tc>
-          <w:tcPr>
-            <w:tcW w:type="dxa" w:w="3408"/>
-            <w:shd w:fill="EBF3FA"/>
-            <w:tcBorders>
-              <w:top w:val="single" w:sz="8" w:color="205B91"/>
-              <w:left w:val="single" w:sz="8" w:color="205B91"/>
-              <w:bottom w:val="single" w:sz="8" w:color="205B91"/>
-              <w:right w:val="single" w:sz="8" w:color="205B91"/>
-              <w:insideH w:val="single" w:sz="8" w:color="205B91"/>
-              <w:insideV w:val="single" w:sz="8" w:color="205B91"/>
-            </w:tcBorders>
-            <w:tcMar>
-              <w:top w:w="100" w:type="dxa"/>
-              <w:start w:w="140" w:type="dxa"/>
-              <w:bottom w:w="100" w:type="dxa"/>
-              <w:end w:w="140" w:type="dxa"/>
-            </w:tcMar>
-            <w:vAlign w:val="center"/>
-          </w:tcPr>
-          <w:p>
-            <w:pPr>
-              <w:spacing w:after="40"/>
-              <w:jc w:val="center"/>
-            </w:pPr>
-            <w:r/>
-            <w:r>
-              <w:rPr>
-                <w:rFonts w:ascii="Arial" w:hAnsi="Arial"/>
-                <w:b/>
-                <w:color w:val="205B91"/>
-                <w:sz w:val="17"/>
-              </w:rPr>
-              <w:t>VALID UP TO</w:t>
-              <w:br/>
-            </w:r>
-            <w:r>
-              <w:rPr>
-                <w:rFonts w:ascii="Arial" w:hAnsi="Arial"/>
-                <w:b/>
-                <w:color w:val="243445"/>
-                <w:sz w:val="22"/>
-              </w:rPr>
-              <w:t>22:17:50</w:t>
-            </w:r>
-          </w:p>
-        </w:tc>
-      </w:tr>
-    </w:tbl>
-    <w:p>
-      <w:pPr>
-        <w:spacing w:after="0"/>
-      </w:pPr>
-    </w:p>
-    <w:p>
-      <w:pPr>
-        <w:spacing w:before="80" w:after="200"/>
+        <w:spacing w:before="0" w:after="0" w:line="259" w:lineRule="auto"/>
         <w:jc w:val="center"/>
       </w:pPr>
       <w:r>
         <w:drawing>
           <wp:inline xmlns:a="http://schemas.openxmlformats.org/drawingml/2006/main" xmlns:pic="http://schemas.openxmlformats.org/drawingml/2006/picture">
-            <wp:extent cx="6492240" cy="4463415"/>
+            <wp:extent cx="5695121" cy="1234440"/>
             <wp:docPr id="1" name="Picture 1"/>
             <wp:cNvGraphicFramePr>
               <a:graphicFrameLocks noChangeAspect="1"/>
@@ -209,11 +19,11 @@
               <a:graphicData uri="http://schemas.openxmlformats.org/drawingml/2006/picture">
                 <pic:pic>
                   <pic:nvPicPr>
-                    <pic:cNvPr id="0" name="final_bulletin.png"/>
+                    <pic:cNvPr id="0" name="imd_header.jpg"/>
                     <pic:cNvPicPr/>
                   </pic:nvPicPr>
                   <pic:blipFill>
-                    <a:blip r:embed="rId10"/>
+                    <a:blip r:embed="rId9"/>
                     <a:stretch>
                       <a:fillRect/>
                     </a:stretch>
@@ -221,7 +31,7 @@
                   <pic:spPr>
                     <a:xfrm>
                       <a:off x="0" y="0"/>
-                      <a:ext cx="6492240" cy="4463415"/>
+                      <a:ext cx="5695121" cy="1234440"/>
                     </a:xfrm>
                     <a:prstGeom prst="rect"/>
                   </pic:spPr>
@@ -234,62 +44,448 @@
     </w:p>
     <w:p>
       <w:pPr>
-        <w:spacing w:after="100"/>
+        <w:spacing w:before="80" w:after="120" w:line="259" w:lineRule="auto"/>
         <w:jc w:val="center"/>
+        <w:pBdr>
+          <w:bottom w:val="single" w:sz="12" w:space="4" w:color="000000"/>
+        </w:pBdr>
       </w:pPr>
       <w:r>
         <w:rPr>
-          <w:rFonts w:ascii="Arial" w:hAnsi="Arial"/>
-          <w:color w:val="E2A22C"/>
-          <w:sz w:val="14"/>
+          <w:rFonts w:ascii="Times New Roman" w:hAnsi="Times New Roman" w:cs="Times New Roman" w:eastAsia="Times New Roman"/>
+          <w:b/>
+          <w:sz w:val="32"/>
         </w:rPr>
-        <w:t>________________________________________________________________</w:t>
+        <w:t>District level Nowcast of Telangana</w:t>
+      </w:r>
+    </w:p>
+    <w:tbl>
+      <w:tblPr>
+        <w:tblW w:type="auto" w:w="0"/>
+        <w:jc w:val="center"/>
+        <w:tblLook w:firstColumn="1" w:firstRow="1" w:lastColumn="0" w:lastRow="0" w:noHBand="0" w:noVBand="1" w:val="04A0"/>
+        <w:tblBorders>
+          <w:top w:val="nil" w:sz="0" w:space="0" w:color="auto"/>
+          <w:left w:val="nil" w:sz="0" w:space="0" w:color="auto"/>
+          <w:bottom w:val="nil" w:sz="0" w:space="0" w:color="auto"/>
+          <w:right w:val="nil" w:sz="0" w:space="0" w:color="auto"/>
+          <w:insideH w:val="nil" w:sz="0" w:space="0" w:color="auto"/>
+          <w:insideV w:val="nil" w:sz="0" w:space="0" w:color="auto"/>
+        </w:tblBorders>
+      </w:tblPr>
+      <w:tblGrid>
+        <w:gridCol w:w="5233"/>
+        <w:gridCol w:w="5233"/>
+      </w:tblGrid>
+      <w:tr>
+        <w:tc>
+          <w:tcPr>
+            <w:tcW w:type="dxa" w:w="5233"/>
+          </w:tcPr>
+          <w:p>
+            <w:r/>
+            <w:r>
+              <w:rPr>
+                <w:rFonts w:ascii="Times New Roman" w:hAnsi="Times New Roman" w:cs="Times New Roman" w:eastAsia="Times New Roman"/>
+                <w:b/>
+                <w:sz w:val="22"/>
+              </w:rPr>
+              <w:t>TIME OF ISSUE: 2026-09-23 (20:36:31 Hrs IST)</w:t>
+            </w:r>
+          </w:p>
+        </w:tc>
+        <w:tc>
+          <w:tcPr>
+            <w:tcW w:type="dxa" w:w="5233"/>
+          </w:tcPr>
+          <w:p>
+            <w:pPr>
+              <w:jc w:val="right"/>
+            </w:pPr>
+            <w:r/>
+            <w:r>
+              <w:rPr>
+                <w:rFonts w:ascii="Times New Roman" w:hAnsi="Times New Roman" w:cs="Times New Roman" w:eastAsia="Times New Roman"/>
+                <w:b/>
+                <w:sz w:val="22"/>
+              </w:rPr>
+              <w:t>Valid upto: (23:36:31 Hrs IST)</w:t>
+            </w:r>
+          </w:p>
+        </w:tc>
+      </w:tr>
+    </w:tbl>
+    <w:p>
+      <w:pPr>
+        <w:spacing w:before="0" w:after="40" w:line="259" w:lineRule="auto"/>
+        <w:jc w:val="left"/>
+      </w:pPr>
+    </w:p>
+    <w:p>
+      <w:pPr>
+        <w:spacing w:before="80" w:after="40" w:line="259" w:lineRule="auto"/>
+        <w:jc w:val="left"/>
+      </w:pPr>
+      <w:r>
+        <w:rPr>
+          <w:rFonts w:ascii="Times New Roman" w:hAnsi="Times New Roman" w:cs="Times New Roman" w:eastAsia="Times New Roman"/>
+          <w:b/>
+          <w:sz w:val="24"/>
+          <w:shd w:val="clear" w:fill="FFA500"/>
+        </w:rPr>
+        <w:t>Orange Warning(Be Prepared)</w:t>
       </w:r>
     </w:p>
     <w:p>
       <w:pPr>
-        <w:spacing w:after="0"/>
+        <w:spacing w:before="0" w:after="40" w:line="259" w:lineRule="auto"/>
+        <w:jc w:val="left"/>
+      </w:pPr>
+      <w:r>
+        <w:rPr>
+          <w:rFonts w:ascii="Times New Roman" w:hAnsi="Times New Roman" w:cs="Times New Roman" w:eastAsia="Times New Roman"/>
+          <w:b w:val="0"/>
+          <w:sz w:val="22"/>
+        </w:rPr>
+        <w:t>Moderate rain likely in HANAMKONDA, J. BHUPALPALLY, JAGTIAL, KARIMNAGAR, MAHABUBNAGAR, NAGARKURNOOL, PEDDAPALLE, WARANGAL districts.</w:t>
+      </w:r>
+    </w:p>
+    <w:p>
+      <w:pPr>
+        <w:spacing w:before="0" w:after="120" w:line="259" w:lineRule="auto"/>
+        <w:jc w:val="left"/>
+      </w:pPr>
+      <w:r>
+        <w:rPr>
+          <w:rFonts w:ascii="Nirmala UI" w:hAnsi="Nirmala UI" w:cs="Nirmala UI" w:eastAsia="Nirmala UI"/>
+          <w:b w:val="0"/>
+          <w:sz w:val="22"/>
+        </w:rPr>
+        <w:t>హన్మకొండ, జయశంకర్ భూపాలపల్లి, జగిత్యాల, కరీంనగర్, మహబూబ్ నగర్, నాగర్ కర్నూల్, పెద్దపల్లి, వరంగల్  జిల్లాల్లో మోస్తరు వర్షం వచ్చే అవకాశం వుంది.</w:t>
+      </w:r>
+    </w:p>
+    <w:p>
+      <w:pPr>
+        <w:spacing w:before="80" w:after="40" w:line="259" w:lineRule="auto"/>
+        <w:jc w:val="left"/>
+      </w:pPr>
+      <w:r>
+        <w:rPr>
+          <w:rFonts w:ascii="Times New Roman" w:hAnsi="Times New Roman" w:cs="Times New Roman" w:eastAsia="Times New Roman"/>
+          <w:b/>
+          <w:sz w:val="24"/>
+          <w:shd w:val="clear" w:fill="FFFF00"/>
+        </w:rPr>
+        <w:t>Yellow Warning(Be Updated)</w:t>
+      </w:r>
+    </w:p>
+    <w:p>
+      <w:pPr>
+        <w:spacing w:before="0" w:after="40" w:line="259" w:lineRule="auto"/>
+        <w:jc w:val="left"/>
+      </w:pPr>
+      <w:r>
+        <w:rPr>
+          <w:rFonts w:ascii="Times New Roman" w:hAnsi="Times New Roman" w:cs="Times New Roman" w:eastAsia="Times New Roman"/>
+          <w:b w:val="0"/>
+          <w:sz w:val="22"/>
+        </w:rPr>
+        <w:t>Light rain: &lt; 5 mm/hr likely in ADILABAD, B. KOTHAGUDEM, JANGAON, KHAMMAM, KUMARAM BHEEM, M. MALKAJGIRI, MAHABUBABAD, MANCHERIAL, MULUGU, NALGONDA, NARAYANPET, NIRMAL, NIZAMABAD, RAJANNA SIRCILLA, SIDDIPET, SURYAPET, WANAPARTHY, Y. BHUVANAGIRI districts.</w:t>
+      </w:r>
+    </w:p>
+    <w:p>
+      <w:pPr>
+        <w:spacing w:before="0" w:after="120" w:line="259" w:lineRule="auto"/>
+        <w:jc w:val="left"/>
+      </w:pPr>
+      <w:r>
+        <w:rPr>
+          <w:rFonts w:ascii="Nirmala UI" w:hAnsi="Nirmala UI" w:cs="Nirmala UI" w:eastAsia="Nirmala UI"/>
+          <w:b w:val="0"/>
+          <w:sz w:val="22"/>
+        </w:rPr>
+        <w:t>ఆదిలాబాద్, భద్రాద్రి కొత్తగూడెం, జనగాం, ఖమ్మం, కొమరం భీమ్ ఆసిఫాబాద్, మేడ్చల్ మల్కాజిగిరి, మహబూబాబాద్, మంచిర్యాలు, ములుగు, నల్గొండ, నారాయణపేట, నిర్మల్, నిజామాబాద్, రాజన్నసిరిసిల్ల, సిద్దిపేట, సూర్యాపేట, వనపర్తి, యాదాద్రి భువనగిరి జిల్లాల్లో తేలికపాటి వర్షం వచ్చే అవకాశం వుంది.</w:t>
+      </w:r>
+    </w:p>
+    <w:tbl>
+      <w:tblPr>
+        <w:tblW w:type="auto" w:w="0"/>
+        <w:jc w:val="center"/>
+        <w:tblLook w:firstColumn="1" w:firstRow="1" w:lastColumn="0" w:lastRow="0" w:noHBand="0" w:noVBand="1" w:val="04A0"/>
+        <w:tblBorders>
+          <w:top w:val="nil" w:sz="0" w:space="0" w:color="auto"/>
+          <w:left w:val="nil" w:sz="0" w:space="0" w:color="auto"/>
+          <w:bottom w:val="nil" w:sz="0" w:space="0" w:color="auto"/>
+          <w:right w:val="nil" w:sz="0" w:space="0" w:color="auto"/>
+          <w:insideH w:val="nil" w:sz="0" w:space="0" w:color="auto"/>
+          <w:insideV w:val="nil" w:sz="0" w:space="0" w:color="auto"/>
+        </w:tblBorders>
+      </w:tblPr>
+      <w:tblGrid>
+        <w:gridCol w:w="5233"/>
+        <w:gridCol w:w="5233"/>
+      </w:tblGrid>
+      <w:tr>
+        <w:tc>
+          <w:tcPr>
+            <w:tcW w:type="dxa" w:w="5233"/>
+            <w:vAlign w:val="top"/>
+          </w:tcPr>
+          <w:p>
+            <w:pPr>
+              <w:jc w:val="center"/>
+            </w:pPr>
+            <w:r/>
+            <w:r>
+              <w:drawing>
+                <wp:inline xmlns:a="http://schemas.openxmlformats.org/drawingml/2006/main" xmlns:pic="http://schemas.openxmlformats.org/drawingml/2006/picture">
+                  <wp:extent cx="3063240" cy="2506287"/>
+                  <wp:docPr id="2" name="Picture 2"/>
+                  <wp:cNvGraphicFramePr>
+                    <a:graphicFrameLocks noChangeAspect="1"/>
+                  </wp:cNvGraphicFramePr>
+                  <a:graphic>
+                    <a:graphicData uri="http://schemas.openxmlformats.org/drawingml/2006/picture">
+                      <pic:pic>
+                        <pic:nvPicPr>
+                          <pic:cNvPr id="0" name="latest_radar.png"/>
+                          <pic:cNvPicPr/>
+                        </pic:nvPicPr>
+                        <pic:blipFill>
+                          <a:blip r:embed="rId10"/>
+                          <a:stretch>
+                            <a:fillRect/>
+                          </a:stretch>
+                        </pic:blipFill>
+                        <pic:spPr>
+                          <a:xfrm>
+                            <a:off x="0" y="0"/>
+                            <a:ext cx="3063240" cy="2506287"/>
+                          </a:xfrm>
+                          <a:prstGeom prst="rect"/>
+                        </pic:spPr>
+                      </pic:pic>
+                    </a:graphicData>
+                  </a:graphic>
+                </wp:inline>
+              </w:drawing>
+            </w:r>
+          </w:p>
+        </w:tc>
+        <w:tc>
+          <w:tcPr>
+            <w:tcW w:type="dxa" w:w="5233"/>
+            <w:vAlign w:val="top"/>
+          </w:tcPr>
+          <w:p>
+            <w:pPr>
+              <w:jc w:val="center"/>
+            </w:pPr>
+            <w:r/>
+            <w:r>
+              <w:drawing>
+                <wp:inline xmlns:a="http://schemas.openxmlformats.org/drawingml/2006/main" xmlns:pic="http://schemas.openxmlformats.org/drawingml/2006/picture">
+                  <wp:extent cx="2654808" cy="3063240"/>
+                  <wp:docPr id="3" name="Picture 3"/>
+                  <wp:cNvGraphicFramePr>
+                    <a:graphicFrameLocks noChangeAspect="1"/>
+                  </wp:cNvGraphicFramePr>
+                  <a:graphic>
+                    <a:graphicData uri="http://schemas.openxmlformats.org/drawingml/2006/picture">
+                      <pic:pic>
+                        <pic:nvPicPr>
+                          <pic:cNvPr id="0" name="latest_warning_map.png"/>
+                          <pic:cNvPicPr/>
+                        </pic:nvPicPr>
+                        <pic:blipFill>
+                          <a:blip r:embed="rId11"/>
+                          <a:stretch>
+                            <a:fillRect/>
+                          </a:stretch>
+                        </pic:blipFill>
+                        <pic:spPr>
+                          <a:xfrm>
+                            <a:off x="0" y="0"/>
+                            <a:ext cx="2654808" cy="3063240"/>
+                          </a:xfrm>
+                          <a:prstGeom prst="rect"/>
+                        </pic:spPr>
+                      </pic:pic>
+                    </a:graphicData>
+                  </a:graphic>
+                </wp:inline>
+              </w:drawing>
+            </w:r>
+          </w:p>
+        </w:tc>
+      </w:tr>
+    </w:tbl>
+    <w:p>
+      <w:pPr>
+        <w:spacing w:before="0" w:after="0"/>
+      </w:pPr>
+      <w:r>
+        <w:br w:type="page"/>
+      </w:r>
+    </w:p>
+    <w:p>
+      <w:pPr>
+        <w:spacing w:before="120" w:after="120" w:line="259" w:lineRule="auto"/>
         <w:jc w:val="center"/>
       </w:pPr>
       <w:r>
+        <w:drawing>
+          <wp:inline xmlns:a="http://schemas.openxmlformats.org/drawingml/2006/main" xmlns:pic="http://schemas.openxmlformats.org/drawingml/2006/picture">
+            <wp:extent cx="6492240" cy="2966440"/>
+            <wp:docPr id="4" name="Picture 4"/>
+            <wp:cNvGraphicFramePr>
+              <a:graphicFrameLocks noChangeAspect="1"/>
+            </wp:cNvGraphicFramePr>
+            <a:graphic>
+              <a:graphicData uri="http://schemas.openxmlformats.org/drawingml/2006/picture">
+                <pic:pic>
+                  <pic:nvPicPr>
+                    <pic:cNvPr id="0" name="expected_impacts_moderate.jpg"/>
+                    <pic:cNvPicPr/>
+                  </pic:nvPicPr>
+                  <pic:blipFill>
+                    <a:blip r:embed="rId12"/>
+                    <a:stretch>
+                      <a:fillRect/>
+                    </a:stretch>
+                  </pic:blipFill>
+                  <pic:spPr>
+                    <a:xfrm>
+                      <a:off x="0" y="0"/>
+                      <a:ext cx="6492240" cy="2966440"/>
+                    </a:xfrm>
+                    <a:prstGeom prst="rect"/>
+                  </pic:spPr>
+                </pic:pic>
+              </a:graphicData>
+            </a:graphic>
+          </wp:inline>
+        </w:drawing>
+      </w:r>
+    </w:p>
+    <w:p>
+      <w:pPr>
+        <w:spacing w:before="0" w:after="0"/>
+      </w:pPr>
+      <w:r>
+        <w:br w:type="page"/>
+      </w:r>
+    </w:p>
+    <w:p>
+      <w:pPr>
+        <w:spacing w:before="120" w:after="120" w:line="259" w:lineRule="auto"/>
+        <w:jc w:val="center"/>
+      </w:pPr>
+      <w:r>
+        <w:drawing>
+          <wp:inline xmlns:a="http://schemas.openxmlformats.org/drawingml/2006/main" xmlns:pic="http://schemas.openxmlformats.org/drawingml/2006/picture">
+            <wp:extent cx="6492240" cy="2838339"/>
+            <wp:docPr id="5" name="Picture 5"/>
+            <wp:cNvGraphicFramePr>
+              <a:graphicFrameLocks noChangeAspect="1"/>
+            </wp:cNvGraphicFramePr>
+            <a:graphic>
+              <a:graphicData uri="http://schemas.openxmlformats.org/drawingml/2006/picture">
+                <pic:pic>
+                  <pic:nvPicPr>
+                    <pic:cNvPr id="0" name="expected_impacts_heavy_rain.jpg"/>
+                    <pic:cNvPicPr/>
+                  </pic:nvPicPr>
+                  <pic:blipFill>
+                    <a:blip r:embed="rId13"/>
+                    <a:stretch>
+                      <a:fillRect/>
+                    </a:stretch>
+                  </pic:blipFill>
+                  <pic:spPr>
+                    <a:xfrm>
+                      <a:off x="0" y="0"/>
+                      <a:ext cx="6492240" cy="2838339"/>
+                    </a:xfrm>
+                    <a:prstGeom prst="rect"/>
+                  </pic:spPr>
+                </pic:pic>
+              </a:graphicData>
+            </a:graphic>
+          </wp:inline>
+        </w:drawing>
+      </w:r>
+    </w:p>
+    <w:p>
+      <w:pPr>
+        <w:spacing w:before="0" w:after="0"/>
+      </w:pPr>
+      <w:r>
+        <w:br w:type="page"/>
+      </w:r>
+    </w:p>
+    <w:p>
+      <w:pPr>
+        <w:spacing w:before="120" w:after="120" w:line="259" w:lineRule="auto"/>
+        <w:jc w:val="center"/>
+      </w:pPr>
+      <w:r>
+        <w:drawing>
+          <wp:inline xmlns:a="http://schemas.openxmlformats.org/drawingml/2006/main" xmlns:pic="http://schemas.openxmlformats.org/drawingml/2006/picture">
+            <wp:extent cx="6492240" cy="4052959"/>
+            <wp:docPr id="6" name="Picture 6"/>
+            <wp:cNvGraphicFramePr>
+              <a:graphicFrameLocks noChangeAspect="1"/>
+            </wp:cNvGraphicFramePr>
+            <a:graphic>
+              <a:graphicData uri="http://schemas.openxmlformats.org/drawingml/2006/picture">
+                <pic:pic>
+                  <pic:nvPicPr>
+                    <pic:cNvPr id="0" name="expected_impacts_very_severe.jpg"/>
+                    <pic:cNvPicPr/>
+                  </pic:nvPicPr>
+                  <pic:blipFill>
+                    <a:blip r:embed="rId14"/>
+                    <a:stretch>
+                      <a:fillRect/>
+                    </a:stretch>
+                  </pic:blipFill>
+                  <pic:spPr>
+                    <a:xfrm>
+                      <a:off x="0" y="0"/>
+                      <a:ext cx="6492240" cy="4052959"/>
+                    </a:xfrm>
+                    <a:prstGeom prst="rect"/>
+                  </pic:spPr>
+                </pic:pic>
+              </a:graphicData>
+            </a:graphic>
+          </wp:inline>
+        </w:drawing>
+      </w:r>
+    </w:p>
+    <w:p>
+      <w:pPr>
+        <w:spacing w:before="360" w:after="0" w:line="259" w:lineRule="auto"/>
+        <w:jc w:val="right"/>
+      </w:pPr>
+      <w:r>
         <w:rPr>
-          <w:rFonts w:ascii="Arial" w:hAnsi="Arial"/>
-          <w:color w:val="243445"/>
-          <w:sz w:val="17"/>
+          <w:rFonts w:ascii="Nirmala UI" w:hAnsi="Nirmala UI" w:cs="Nirmala UI" w:eastAsia="Nirmala UI"/>
+          <w:b w:val="0"/>
+          <w:sz w:val="24"/>
         </w:rPr>
-        <w:t>Source: India Meteorological Department | Telangana nowcast products</w:t>
+        <w:t>డ్యూటీ అధికారి / ड्यूटी अधिकारी / Duty Officer</w:t>
       </w:r>
     </w:p>
     <w:sectPr>
-      <w:headerReference w:type="default" r:id="rId9"/>
-      <w:pgSz w:w="12240" w:h="15840"/>
-      <w:pgMar w:top="792" w:right="1008" w:bottom="792" w:left="1008" w:header="360" w:footer="360" w:gutter="0"/>
+      <w:pgSz w:w="11906" w:h="16838"/>
+      <w:pgMar w:top="720" w:right="720" w:bottom="720" w:left="720" w:header="720" w:footer="720" w:gutter="0"/>
       <w:cols w:space="720"/>
       <w:docGrid w:linePitch="360"/>
     </w:sectPr>
   </w:body>
 </w:document>
-</file>
-
-<file path=word/header1.xml><?xml version="1.0" encoding="utf-8"?>
-<w:hdr xmlns:m="http://schemas.openxmlformats.org/officeDocument/2006/math" xmlns:mc="http://schemas.openxmlformats.org/markup-compatibility/2006" xmlns:mo="http://schemas.microsoft.com/office/mac/office/2008/main" xmlns:mv="urn:schemas-microsoft-com:mac:vml" xmlns:o="urn:schemas-microsoft-com:office:office" xmlns:r="http://schemas.openxmlformats.org/officeDocument/2006/relationships" xmlns:v="urn:schemas-microsoft-com:vml" xmlns:w10="urn:schemas-microsoft-com:office:word" xmlns:w14="http://schemas.microsoft.com/office/word/2010/wordml" xmlns:w="http://schemas.openxmlformats.org/wordprocessingml/2006/main" xmlns:wne="http://schemas.microsoft.com/office/word/2006/wordml" xmlns:wp14="http://schemas.microsoft.com/office/word/2010/wordprocessingDrawing" xmlns:wp="http://schemas.openxmlformats.org/drawingml/2006/wordprocessingDrawing" xmlns:wpc="http://schemas.microsoft.com/office/word/2010/wordprocessingCanvas" xmlns:wpg="http://schemas.microsoft.com/office/word/2010/wordprocessingGroup" xmlns:wpi="http://schemas.microsoft.com/office/word/2010/wordprocessingInk" xmlns:wps="http://schemas.microsoft.com/office/word/2010/wordprocessingShape" mc:Ignorable="w14 wp14">
-  <w:p>
-    <w:pPr>
-      <w:pStyle w:val="Header"/>
-      <w:spacing w:after="0"/>
-      <w:jc w:val="center"/>
-    </w:pPr>
-    <w:r>
-      <w:rPr>
-        <w:rFonts w:ascii="Arial" w:hAnsi="Arial"/>
-        <w:b/>
-        <w:color w:val="0C2F52"/>
-        <w:sz w:val="20"/>
-      </w:rPr>
-      <w:t>INDIA METEOROLOGICAL DEPARTMENT</w:t>
-    </w:r>
-  </w:p>
-</w:hdr>
 </file>
 
 <file path=word/numbering.xml><?xml version="1.0" encoding="utf-8"?>
@@ -655,10 +851,6 @@
     <w:name w:val="Normal"/>
     <w:qFormat/>
     <w:rsid w:val="00FC693F"/>
-    <w:rPr>
-      <w:rFonts w:ascii="Arial" w:hAnsi="Arial"/>
-      <w:sz w:val="20"/>
-    </w:rPr>
   </w:style>
   <w:style w:type="paragraph" w:styleId="Header">
     <w:name w:val="header"/>

</xml_diff>

<commit_message>
Regenerate the bulletin from the latest IMD issue time.
The Word file was left unchanged by the image step and kept a clock timestamp from the previous run.

Co-authored-by: Cursor <cursoragent@cursor.com>
</commit_message>
<xml_diff>
--- a/IMD_Nowcast_Bulletin.docx
+++ b/IMD_Nowcast_Bulletin.docx
@@ -90,7 +90,7 @@
                 <w:b/>
                 <w:sz w:val="22"/>
               </w:rPr>
-              <w:t>TIME OF ISSUE: 2026-09-23 (20:36:31 Hrs IST)</w:t>
+              <w:t>TIME OF ISSUE: 2026-09-24 (20:02:40 Hrs IST)</w:t>
             </w:r>
           </w:p>
         </w:tc>
@@ -109,7 +109,7 @@
                 <w:b/>
                 <w:sz w:val="22"/>
               </w:rPr>
-              <w:t>Valid upto: (23:36:31 Hrs IST)</w:t>
+              <w:t>Valid upto: (23:02:40 Hrs IST)</w:t>
             </w:r>
           </w:p>
         </w:tc>
@@ -138,34 +138,6 @@
     </w:p>
     <w:p>
       <w:pPr>
-        <w:spacing w:before="0" w:after="40" w:line="259" w:lineRule="auto"/>
-        <w:jc w:val="left"/>
-      </w:pPr>
-      <w:r>
-        <w:rPr>
-          <w:rFonts w:ascii="Times New Roman" w:hAnsi="Times New Roman" w:cs="Times New Roman" w:eastAsia="Times New Roman"/>
-          <w:b w:val="0"/>
-          <w:sz w:val="22"/>
-        </w:rPr>
-        <w:t>Moderate rain likely in HANAMKONDA, J. BHUPALPALLY, JAGTIAL, KARIMNAGAR, MAHABUBNAGAR, NAGARKURNOOL, PEDDAPALLE, WARANGAL districts.</w:t>
-      </w:r>
-    </w:p>
-    <w:p>
-      <w:pPr>
-        <w:spacing w:before="0" w:after="120" w:line="259" w:lineRule="auto"/>
-        <w:jc w:val="left"/>
-      </w:pPr>
-      <w:r>
-        <w:rPr>
-          <w:rFonts w:ascii="Nirmala UI" w:hAnsi="Nirmala UI" w:cs="Nirmala UI" w:eastAsia="Nirmala UI"/>
-          <w:b w:val="0"/>
-          <w:sz w:val="22"/>
-        </w:rPr>
-        <w:t>హన్మకొండ, జయశంకర్ భూపాలపల్లి, జగిత్యాల, కరీంనగర్, మహబూబ్ నగర్, నాగర్ కర్నూల్, పెద్దపల్లి, వరంగల్  జిల్లాల్లో మోస్తరు వర్షం వచ్చే అవకాశం వుంది.</w:t>
-      </w:r>
-    </w:p>
-    <w:p>
-      <w:pPr>
         <w:spacing w:before="80" w:after="40" w:line="259" w:lineRule="auto"/>
         <w:jc w:val="left"/>
       </w:pPr>
@@ -190,7 +162,7 @@
           <w:b w:val="0"/>
           <w:sz w:val="22"/>
         </w:rPr>
-        <w:t>Light rain: &lt; 5 mm/hr likely in ADILABAD, B. KOTHAGUDEM, JANGAON, KHAMMAM, KUMARAM BHEEM, M. MALKAJGIRI, MAHABUBABAD, MANCHERIAL, MULUGU, NALGONDA, NARAYANPET, NIRMAL, NIZAMABAD, RAJANNA SIRCILLA, SIDDIPET, SURYAPET, WANAPARTHY, Y. BHUVANAGIRI districts.</w:t>
+        <w:t>Light rain: &lt; 5 mm/hr and Light Thunderstorms with maximum surface wind speed less than 40 kmph. likely in B. KOTHAGUDEM, HYDERABAD, JAGTIAL, KAMAREDDY, KARIMNAGAR, KHAMMAM, M. MALKAJGIRI, MAHABUBNAGAR, MEDAK, NAGARKURNOOL, NALGONDA, RAJANNA SIRCILLA, RANGAREDDY, SIDDIPET, SURYAPET, WANAPARTHY, Y. BHUVANAGIRI districts.</w:t>
       </w:r>
     </w:p>
     <w:p>
@@ -204,7 +176,7 @@
           <w:b w:val="0"/>
           <w:sz w:val="22"/>
         </w:rPr>
-        <w:t>ఆదిలాబాద్, భద్రాద్రి కొత్తగూడెం, జనగాం, ఖమ్మం, కొమరం భీమ్ ఆసిఫాబాద్, మేడ్చల్ మల్కాజిగిరి, మహబూబాబాద్, మంచిర్యాలు, ములుగు, నల్గొండ, నారాయణపేట, నిర్మల్, నిజామాబాద్, రాజన్నసిరిసిల్ల, సిద్దిపేట, సూర్యాపేట, వనపర్తి, యాదాద్రి భువనగిరి జిల్లాల్లో తేలికపాటి వర్షం వచ్చే అవకాశం వుంది.</w:t>
+        <w:t>భద్రాద్రి కొత్తగూడెం, హైదరాబాద్, జగిత్యాల, కామారెడ్డి, కరీంనగర్, ఖమ్మం, మేడ్చల్ మల్కాజిగిరి, మహబూబ్ నగర్, మెదక్, నాగర్ కర్నూల్, నల్గొండ, రాజన్నసిరిసిల్ల, రంగారెడ్డి, సిద్దిపేట, సూర్యాపేట, వనపర్తి, యాదాద్రి భువనగిరి జిల్లాల్లో తేలికపాటి వర్షం మరియు ఉరుములతో కూడిన తేలికపాటి వర్షం (గాలి వేగం గంటకు 40 కిమీ వరకు) వచ్చే అవకాశం వుంది.</w:t>
       </w:r>
     </w:p>
     <w:tbl>

</xml_diff>

<commit_message>
Refresh generated bulletin outputs from the latest IMD nowcast run.
Co-authored-by: Cursor <cursoragent@cursor.com>
</commit_message>
<xml_diff>
--- a/IMD_Nowcast_Bulletin.docx
+++ b/IMD_Nowcast_Bulletin.docx
@@ -90,7 +90,7 @@
                 <w:b/>
                 <w:sz w:val="22"/>
               </w:rPr>
-              <w:t>TIME OF ISSUE: 2026-09-24 (20:02:40 Hrs IST)</w:t>
+              <w:t>TIME OF ISSUE: 2026-09-24 (21:15:02 Hrs IST)</w:t>
             </w:r>
           </w:p>
         </w:tc>
@@ -109,7 +109,7 @@
                 <w:b/>
                 <w:sz w:val="22"/>
               </w:rPr>
-              <w:t>Valid upto: (23:02:40 Hrs IST)</w:t>
+              <w:t>Valid upto: (00:15:02 Hrs IST)</w:t>
             </w:r>
           </w:p>
         </w:tc>

</xml_diff>

<commit_message>
Match the generated bulletin to the single-page IMD nowcast format.
Co-authored-by: Cursor <cursoragent@cursor.com>
</commit_message>
<xml_diff>
--- a/IMD_Nowcast_Bulletin.docx
+++ b/IMD_Nowcast_Bulletin.docx
@@ -4,13 +4,199 @@
   <w:body>
     <w:p>
       <w:pPr>
-        <w:spacing w:before="0" w:after="0" w:line="259" w:lineRule="auto"/>
+        <w:spacing w:before="120" w:after="40" w:line="240" w:lineRule="auto"/>
+        <w:jc w:val="center"/>
+      </w:pPr>
+      <w:r>
+        <w:rPr>
+          <w:rFonts w:ascii="Arial" w:hAnsi="Arial" w:cs="Arial" w:eastAsia="Arial"/>
+          <w:b/>
+          <w:color w:val="0C2F52"/>
+          <w:sz w:val="48"/>
+        </w:rPr>
+        <w:t>NOWCAST BULLETIN</w:t>
+      </w:r>
+    </w:p>
+    <w:p>
+      <w:pPr>
+        <w:spacing w:before="0" w:after="240" w:line="240" w:lineRule="auto"/>
+        <w:jc w:val="center"/>
+      </w:pPr>
+      <w:r>
+        <w:rPr>
+          <w:rFonts w:ascii="Arial" w:hAnsi="Arial" w:cs="Arial" w:eastAsia="Arial"/>
+          <w:b/>
+          <w:color w:val="205B91"/>
+          <w:sz w:val="30"/>
+        </w:rPr>
+        <w:t>TELANGANA</w:t>
+      </w:r>
+    </w:p>
+    <w:tbl>
+      <w:tblPr>
+        <w:tblW w:type="auto" w:w="0"/>
+        <w:jc w:val="center"/>
+        <w:tblLayout w:type="fixed"/>
+        <w:tblLook w:firstColumn="1" w:firstRow="1" w:lastColumn="0" w:lastRow="0" w:noHBand="0" w:noVBand="1" w:val="04A0"/>
+      </w:tblPr>
+      <w:tblGrid>
+        <w:gridCol w:w="3408"/>
+        <w:gridCol w:w="3408"/>
+        <w:gridCol w:w="3408"/>
+      </w:tblGrid>
+      <w:tr>
+        <w:tc>
+          <w:tcPr>
+            <w:tcW w:type="dxa" w:w="3407"/>
+            <w:shd w:val="clear" w:color="auto" w:fill="EBF3FA"/>
+            <w:tcBorders>
+              <w:top w:val="single" w:sz="8" w:space="0" w:color="205B91"/>
+              <w:left w:val="single" w:sz="8" w:space="0" w:color="205B91"/>
+              <w:bottom w:val="single" w:sz="8" w:space="0" w:color="205B91"/>
+              <w:right w:val="single" w:sz="8" w:space="0" w:color="205B91"/>
+            </w:tcBorders>
+            <w:tcMar>
+              <w:top w:w="100" w:type="dxa"/>
+              <w:bottom w:w="100" w:type="dxa"/>
+              <w:start w:w="140" w:type="dxa"/>
+              <w:end w:w="140" w:type="dxa"/>
+            </w:tcMar>
+            <w:vAlign w:val="center"/>
+          </w:tcPr>
+          <w:p>
+            <w:pPr>
+              <w:spacing w:after="40"/>
+              <w:jc w:val="center"/>
+            </w:pPr>
+            <w:r/>
+            <w:r>
+              <w:rPr>
+                <w:rFonts w:ascii="Arial" w:hAnsi="Arial" w:cs="Arial" w:eastAsia="Arial"/>
+                <w:b/>
+                <w:color w:val="205B91"/>
+                <w:sz w:val="17"/>
+              </w:rPr>
+              <w:t>BULLETIN DATE</w:t>
+              <w:br/>
+            </w:r>
+            <w:r>
+              <w:rPr>
+                <w:rFonts w:ascii="Arial" w:hAnsi="Arial" w:cs="Arial" w:eastAsia="Arial"/>
+                <w:b/>
+                <w:color w:val="243445"/>
+                <w:sz w:val="22"/>
+              </w:rPr>
+              <w:t>2026-09-25</w:t>
+            </w:r>
+          </w:p>
+        </w:tc>
+        <w:tc>
+          <w:tcPr>
+            <w:tcW w:type="dxa" w:w="3407"/>
+            <w:shd w:val="clear" w:color="auto" w:fill="EBF3FA"/>
+            <w:tcBorders>
+              <w:top w:val="single" w:sz="8" w:space="0" w:color="205B91"/>
+              <w:left w:val="single" w:sz="8" w:space="0" w:color="205B91"/>
+              <w:bottom w:val="single" w:sz="8" w:space="0" w:color="205B91"/>
+              <w:right w:val="single" w:sz="8" w:space="0" w:color="205B91"/>
+            </w:tcBorders>
+            <w:tcMar>
+              <w:top w:w="100" w:type="dxa"/>
+              <w:bottom w:w="100" w:type="dxa"/>
+              <w:start w:w="140" w:type="dxa"/>
+              <w:end w:w="140" w:type="dxa"/>
+            </w:tcMar>
+            <w:vAlign w:val="center"/>
+          </w:tcPr>
+          <w:p>
+            <w:pPr>
+              <w:spacing w:after="40"/>
+              <w:jc w:val="center"/>
+            </w:pPr>
+            <w:r/>
+            <w:r>
+              <w:rPr>
+                <w:rFonts w:ascii="Arial" w:hAnsi="Arial" w:cs="Arial" w:eastAsia="Arial"/>
+                <w:b/>
+                <w:color w:val="205B91"/>
+                <w:sz w:val="17"/>
+              </w:rPr>
+              <w:t>TIME OF ISSUE</w:t>
+              <w:br/>
+            </w:r>
+            <w:r>
+              <w:rPr>
+                <w:rFonts w:ascii="Arial" w:hAnsi="Arial" w:cs="Arial" w:eastAsia="Arial"/>
+                <w:b/>
+                <w:color w:val="243445"/>
+                <w:sz w:val="22"/>
+              </w:rPr>
+              <w:t>23:00:42</w:t>
+            </w:r>
+          </w:p>
+        </w:tc>
+        <w:tc>
+          <w:tcPr>
+            <w:tcW w:type="dxa" w:w="3407"/>
+            <w:shd w:val="clear" w:color="auto" w:fill="EBF3FA"/>
+            <w:tcBorders>
+              <w:top w:val="single" w:sz="8" w:space="0" w:color="205B91"/>
+              <w:left w:val="single" w:sz="8" w:space="0" w:color="205B91"/>
+              <w:bottom w:val="single" w:sz="8" w:space="0" w:color="205B91"/>
+              <w:right w:val="single" w:sz="8" w:space="0" w:color="205B91"/>
+            </w:tcBorders>
+            <w:tcMar>
+              <w:top w:w="100" w:type="dxa"/>
+              <w:bottom w:w="100" w:type="dxa"/>
+              <w:start w:w="140" w:type="dxa"/>
+              <w:end w:w="140" w:type="dxa"/>
+            </w:tcMar>
+            <w:vAlign w:val="center"/>
+          </w:tcPr>
+          <w:p>
+            <w:pPr>
+              <w:spacing w:after="40"/>
+              <w:jc w:val="center"/>
+            </w:pPr>
+            <w:r/>
+            <w:r>
+              <w:rPr>
+                <w:rFonts w:ascii="Arial" w:hAnsi="Arial" w:cs="Arial" w:eastAsia="Arial"/>
+                <w:b/>
+                <w:color w:val="205B91"/>
+                <w:sz w:val="17"/>
+              </w:rPr>
+              <w:t>VALID UP TO</w:t>
+              <w:br/>
+            </w:r>
+            <w:r>
+              <w:rPr>
+                <w:rFonts w:ascii="Arial" w:hAnsi="Arial" w:cs="Arial" w:eastAsia="Arial"/>
+                <w:b/>
+                <w:color w:val="243445"/>
+                <w:sz w:val="22"/>
+              </w:rPr>
+              <w:t>02:00:42</w:t>
+            </w:r>
+          </w:p>
+        </w:tc>
+      </w:tr>
+    </w:tbl>
+    <w:p>
+      <w:pPr>
+        <w:spacing w:before="0" w:after="0" w:line="240" w:lineRule="auto"/>
+        <w:jc w:val="left"/>
+      </w:pPr>
+    </w:p>
+    <w:p>
+      <w:pPr>
+        <w:spacing w:before="80" w:after="200" w:line="240" w:lineRule="auto"/>
         <w:jc w:val="center"/>
       </w:pPr>
       <w:r>
         <w:drawing>
           <wp:inline xmlns:a="http://schemas.openxmlformats.org/drawingml/2006/main" xmlns:pic="http://schemas.openxmlformats.org/drawingml/2006/picture">
-            <wp:extent cx="5695121" cy="1234440"/>
+            <wp:extent cx="6492240" cy="4463415"/>
             <wp:docPr id="1" name="Picture 1"/>
             <wp:cNvGraphicFramePr>
               <a:graphicFrameLocks noChangeAspect="1"/>
@@ -19,11 +205,11 @@
               <a:graphicData uri="http://schemas.openxmlformats.org/drawingml/2006/picture">
                 <pic:pic>
                   <pic:nvPicPr>
-                    <pic:cNvPr id="0" name="imd_header.jpg"/>
+                    <pic:cNvPr id="0" name="final_bulletin.png"/>
                     <pic:cNvPicPr/>
                   </pic:nvPicPr>
                   <pic:blipFill>
-                    <a:blip r:embed="rId9"/>
+                    <a:blip r:embed="rId10"/>
                     <a:stretch>
                       <a:fillRect/>
                     </a:stretch>
@@ -31,7 +217,7 @@
                   <pic:spPr>
                     <a:xfrm>
                       <a:off x="0" y="0"/>
-                      <a:ext cx="5695121" cy="1234440"/>
+                      <a:ext cx="6492240" cy="4463415"/>
                     </a:xfrm>
                     <a:prstGeom prst="rect"/>
                   </pic:spPr>
@@ -44,420 +230,64 @@
     </w:p>
     <w:p>
       <w:pPr>
-        <w:spacing w:before="80" w:after="120" w:line="259" w:lineRule="auto"/>
+        <w:spacing w:before="0" w:after="100" w:line="240" w:lineRule="auto"/>
         <w:jc w:val="center"/>
-        <w:pBdr>
-          <w:bottom w:val="single" w:sz="12" w:space="4" w:color="000000"/>
-        </w:pBdr>
       </w:pPr>
       <w:r>
         <w:rPr>
-          <w:rFonts w:ascii="Times New Roman" w:hAnsi="Times New Roman" w:cs="Times New Roman" w:eastAsia="Times New Roman"/>
-          <w:b/>
-          <w:sz w:val="32"/>
+          <w:rFonts w:ascii="Arial" w:hAnsi="Arial" w:cs="Arial" w:eastAsia="Arial"/>
+          <w:b w:val="0"/>
+          <w:color w:val="E2A22C"/>
+          <w:sz w:val="14"/>
         </w:rPr>
-        <w:t>District level Nowcast of Telangana</w:t>
-      </w:r>
-    </w:p>
-    <w:tbl>
-      <w:tblPr>
-        <w:tblW w:type="auto" w:w="0"/>
-        <w:jc w:val="center"/>
-        <w:tblLook w:firstColumn="1" w:firstRow="1" w:lastColumn="0" w:lastRow="0" w:noHBand="0" w:noVBand="1" w:val="04A0"/>
-        <w:tblBorders>
-          <w:top w:val="nil" w:sz="0" w:space="0" w:color="auto"/>
-          <w:left w:val="nil" w:sz="0" w:space="0" w:color="auto"/>
-          <w:bottom w:val="nil" w:sz="0" w:space="0" w:color="auto"/>
-          <w:right w:val="nil" w:sz="0" w:space="0" w:color="auto"/>
-          <w:insideH w:val="nil" w:sz="0" w:space="0" w:color="auto"/>
-          <w:insideV w:val="nil" w:sz="0" w:space="0" w:color="auto"/>
-        </w:tblBorders>
-      </w:tblPr>
-      <w:tblGrid>
-        <w:gridCol w:w="5233"/>
-        <w:gridCol w:w="5233"/>
-      </w:tblGrid>
-      <w:tr>
-        <w:tc>
-          <w:tcPr>
-            <w:tcW w:type="dxa" w:w="5233"/>
-          </w:tcPr>
-          <w:p>
-            <w:r/>
-            <w:r>
-              <w:rPr>
-                <w:rFonts w:ascii="Times New Roman" w:hAnsi="Times New Roman" w:cs="Times New Roman" w:eastAsia="Times New Roman"/>
-                <w:b/>
-                <w:sz w:val="22"/>
-              </w:rPr>
-              <w:t>TIME OF ISSUE: 2026-09-24 (21:15:02 Hrs IST)</w:t>
-            </w:r>
-          </w:p>
-        </w:tc>
-        <w:tc>
-          <w:tcPr>
-            <w:tcW w:type="dxa" w:w="5233"/>
-          </w:tcPr>
-          <w:p>
-            <w:pPr>
-              <w:jc w:val="right"/>
-            </w:pPr>
-            <w:r/>
-            <w:r>
-              <w:rPr>
-                <w:rFonts w:ascii="Times New Roman" w:hAnsi="Times New Roman" w:cs="Times New Roman" w:eastAsia="Times New Roman"/>
-                <w:b/>
-                <w:sz w:val="22"/>
-              </w:rPr>
-              <w:t>Valid upto: (00:15:02 Hrs IST)</w:t>
-            </w:r>
-          </w:p>
-        </w:tc>
-      </w:tr>
-    </w:tbl>
-    <w:p>
-      <w:pPr>
-        <w:spacing w:before="0" w:after="40" w:line="259" w:lineRule="auto"/>
-        <w:jc w:val="left"/>
-      </w:pPr>
-    </w:p>
-    <w:p>
-      <w:pPr>
-        <w:spacing w:before="80" w:after="40" w:line="259" w:lineRule="auto"/>
-        <w:jc w:val="left"/>
-      </w:pPr>
-      <w:r>
-        <w:rPr>
-          <w:rFonts w:ascii="Times New Roman" w:hAnsi="Times New Roman" w:cs="Times New Roman" w:eastAsia="Times New Roman"/>
-          <w:b/>
-          <w:sz w:val="24"/>
-          <w:shd w:val="clear" w:fill="FFA500"/>
-        </w:rPr>
-        <w:t>Orange Warning(Be Prepared)</w:t>
+        <w:t>________________________________________________________________</w:t>
       </w:r>
     </w:p>
     <w:p>
       <w:pPr>
-        <w:spacing w:before="80" w:after="40" w:line="259" w:lineRule="auto"/>
-        <w:jc w:val="left"/>
+        <w:spacing w:before="0" w:after="0" w:line="240" w:lineRule="auto"/>
+        <w:jc w:val="center"/>
       </w:pPr>
       <w:r>
         <w:rPr>
-          <w:rFonts w:ascii="Times New Roman" w:hAnsi="Times New Roman" w:cs="Times New Roman" w:eastAsia="Times New Roman"/>
-          <w:b/>
-          <w:sz w:val="24"/>
-          <w:shd w:val="clear" w:fill="FFFF00"/>
+          <w:rFonts w:ascii="Arial" w:hAnsi="Arial" w:cs="Arial" w:eastAsia="Arial"/>
+          <w:b w:val="0"/>
+          <w:color w:val="243445"/>
+          <w:sz w:val="17"/>
         </w:rPr>
-        <w:t>Yellow Warning(Be Updated)</w:t>
-      </w:r>
-    </w:p>
-    <w:p>
-      <w:pPr>
-        <w:spacing w:before="0" w:after="40" w:line="259" w:lineRule="auto"/>
-        <w:jc w:val="left"/>
-      </w:pPr>
-      <w:r>
-        <w:rPr>
-          <w:rFonts w:ascii="Times New Roman" w:hAnsi="Times New Roman" w:cs="Times New Roman" w:eastAsia="Times New Roman"/>
-          <w:b w:val="0"/>
-          <w:sz w:val="22"/>
-        </w:rPr>
-        <w:t>Light rain: &lt; 5 mm/hr and Light Thunderstorms with maximum surface wind speed less than 40 kmph. likely in B. KOTHAGUDEM, HYDERABAD, JAGTIAL, KAMAREDDY, KARIMNAGAR, KHAMMAM, M. MALKAJGIRI, MAHABUBNAGAR, MEDAK, NAGARKURNOOL, NALGONDA, RAJANNA SIRCILLA, RANGAREDDY, SIDDIPET, SURYAPET, WANAPARTHY, Y. BHUVANAGIRI districts.</w:t>
-      </w:r>
-    </w:p>
-    <w:p>
-      <w:pPr>
-        <w:spacing w:before="0" w:after="120" w:line="259" w:lineRule="auto"/>
-        <w:jc w:val="left"/>
-      </w:pPr>
-      <w:r>
-        <w:rPr>
-          <w:rFonts w:ascii="Nirmala UI" w:hAnsi="Nirmala UI" w:cs="Nirmala UI" w:eastAsia="Nirmala UI"/>
-          <w:b w:val="0"/>
-          <w:sz w:val="22"/>
-        </w:rPr>
-        <w:t>భద్రాద్రి కొత్తగూడెం, హైదరాబాద్, జగిత్యాల, కామారెడ్డి, కరీంనగర్, ఖమ్మం, మేడ్చల్ మల్కాజిగిరి, మహబూబ్ నగర్, మెదక్, నాగర్ కర్నూల్, నల్గొండ, రాజన్నసిరిసిల్ల, రంగారెడ్డి, సిద్దిపేట, సూర్యాపేట, వనపర్తి, యాదాద్రి భువనగిరి జిల్లాల్లో తేలికపాటి వర్షం మరియు ఉరుములతో కూడిన తేలికపాటి వర్షం (గాలి వేగం గంటకు 40 కిమీ వరకు) వచ్చే అవకాశం వుంది.</w:t>
-      </w:r>
-    </w:p>
-    <w:tbl>
-      <w:tblPr>
-        <w:tblW w:type="auto" w:w="0"/>
-        <w:jc w:val="center"/>
-        <w:tblLook w:firstColumn="1" w:firstRow="1" w:lastColumn="0" w:lastRow="0" w:noHBand="0" w:noVBand="1" w:val="04A0"/>
-        <w:tblBorders>
-          <w:top w:val="nil" w:sz="0" w:space="0" w:color="auto"/>
-          <w:left w:val="nil" w:sz="0" w:space="0" w:color="auto"/>
-          <w:bottom w:val="nil" w:sz="0" w:space="0" w:color="auto"/>
-          <w:right w:val="nil" w:sz="0" w:space="0" w:color="auto"/>
-          <w:insideH w:val="nil" w:sz="0" w:space="0" w:color="auto"/>
-          <w:insideV w:val="nil" w:sz="0" w:space="0" w:color="auto"/>
-        </w:tblBorders>
-      </w:tblPr>
-      <w:tblGrid>
-        <w:gridCol w:w="5233"/>
-        <w:gridCol w:w="5233"/>
-      </w:tblGrid>
-      <w:tr>
-        <w:tc>
-          <w:tcPr>
-            <w:tcW w:type="dxa" w:w="5233"/>
-            <w:vAlign w:val="top"/>
-          </w:tcPr>
-          <w:p>
-            <w:pPr>
-              <w:jc w:val="center"/>
-            </w:pPr>
-            <w:r/>
-            <w:r>
-              <w:drawing>
-                <wp:inline xmlns:a="http://schemas.openxmlformats.org/drawingml/2006/main" xmlns:pic="http://schemas.openxmlformats.org/drawingml/2006/picture">
-                  <wp:extent cx="3063240" cy="2506287"/>
-                  <wp:docPr id="2" name="Picture 2"/>
-                  <wp:cNvGraphicFramePr>
-                    <a:graphicFrameLocks noChangeAspect="1"/>
-                  </wp:cNvGraphicFramePr>
-                  <a:graphic>
-                    <a:graphicData uri="http://schemas.openxmlformats.org/drawingml/2006/picture">
-                      <pic:pic>
-                        <pic:nvPicPr>
-                          <pic:cNvPr id="0" name="latest_radar.png"/>
-                          <pic:cNvPicPr/>
-                        </pic:nvPicPr>
-                        <pic:blipFill>
-                          <a:blip r:embed="rId10"/>
-                          <a:stretch>
-                            <a:fillRect/>
-                          </a:stretch>
-                        </pic:blipFill>
-                        <pic:spPr>
-                          <a:xfrm>
-                            <a:off x="0" y="0"/>
-                            <a:ext cx="3063240" cy="2506287"/>
-                          </a:xfrm>
-                          <a:prstGeom prst="rect"/>
-                        </pic:spPr>
-                      </pic:pic>
-                    </a:graphicData>
-                  </a:graphic>
-                </wp:inline>
-              </w:drawing>
-            </w:r>
-          </w:p>
-        </w:tc>
-        <w:tc>
-          <w:tcPr>
-            <w:tcW w:type="dxa" w:w="5233"/>
-            <w:vAlign w:val="top"/>
-          </w:tcPr>
-          <w:p>
-            <w:pPr>
-              <w:jc w:val="center"/>
-            </w:pPr>
-            <w:r/>
-            <w:r>
-              <w:drawing>
-                <wp:inline xmlns:a="http://schemas.openxmlformats.org/drawingml/2006/main" xmlns:pic="http://schemas.openxmlformats.org/drawingml/2006/picture">
-                  <wp:extent cx="2654808" cy="3063240"/>
-                  <wp:docPr id="3" name="Picture 3"/>
-                  <wp:cNvGraphicFramePr>
-                    <a:graphicFrameLocks noChangeAspect="1"/>
-                  </wp:cNvGraphicFramePr>
-                  <a:graphic>
-                    <a:graphicData uri="http://schemas.openxmlformats.org/drawingml/2006/picture">
-                      <pic:pic>
-                        <pic:nvPicPr>
-                          <pic:cNvPr id="0" name="latest_warning_map.png"/>
-                          <pic:cNvPicPr/>
-                        </pic:nvPicPr>
-                        <pic:blipFill>
-                          <a:blip r:embed="rId11"/>
-                          <a:stretch>
-                            <a:fillRect/>
-                          </a:stretch>
-                        </pic:blipFill>
-                        <pic:spPr>
-                          <a:xfrm>
-                            <a:off x="0" y="0"/>
-                            <a:ext cx="2654808" cy="3063240"/>
-                          </a:xfrm>
-                          <a:prstGeom prst="rect"/>
-                        </pic:spPr>
-                      </pic:pic>
-                    </a:graphicData>
-                  </a:graphic>
-                </wp:inline>
-              </w:drawing>
-            </w:r>
-          </w:p>
-        </w:tc>
-      </w:tr>
-    </w:tbl>
-    <w:p>
-      <w:pPr>
-        <w:spacing w:before="0" w:after="0"/>
-      </w:pPr>
-      <w:r>
-        <w:br w:type="page"/>
-      </w:r>
-    </w:p>
-    <w:p>
-      <w:pPr>
-        <w:spacing w:before="120" w:after="120" w:line="259" w:lineRule="auto"/>
-        <w:jc w:val="center"/>
-      </w:pPr>
-      <w:r>
-        <w:drawing>
-          <wp:inline xmlns:a="http://schemas.openxmlformats.org/drawingml/2006/main" xmlns:pic="http://schemas.openxmlformats.org/drawingml/2006/picture">
-            <wp:extent cx="6492240" cy="2966440"/>
-            <wp:docPr id="4" name="Picture 4"/>
-            <wp:cNvGraphicFramePr>
-              <a:graphicFrameLocks noChangeAspect="1"/>
-            </wp:cNvGraphicFramePr>
-            <a:graphic>
-              <a:graphicData uri="http://schemas.openxmlformats.org/drawingml/2006/picture">
-                <pic:pic>
-                  <pic:nvPicPr>
-                    <pic:cNvPr id="0" name="expected_impacts_moderate.jpg"/>
-                    <pic:cNvPicPr/>
-                  </pic:nvPicPr>
-                  <pic:blipFill>
-                    <a:blip r:embed="rId12"/>
-                    <a:stretch>
-                      <a:fillRect/>
-                    </a:stretch>
-                  </pic:blipFill>
-                  <pic:spPr>
-                    <a:xfrm>
-                      <a:off x="0" y="0"/>
-                      <a:ext cx="6492240" cy="2966440"/>
-                    </a:xfrm>
-                    <a:prstGeom prst="rect"/>
-                  </pic:spPr>
-                </pic:pic>
-              </a:graphicData>
-            </a:graphic>
-          </wp:inline>
-        </w:drawing>
-      </w:r>
-    </w:p>
-    <w:p>
-      <w:pPr>
-        <w:spacing w:before="0" w:after="0"/>
-      </w:pPr>
-      <w:r>
-        <w:br w:type="page"/>
-      </w:r>
-    </w:p>
-    <w:p>
-      <w:pPr>
-        <w:spacing w:before="120" w:after="120" w:line="259" w:lineRule="auto"/>
-        <w:jc w:val="center"/>
-      </w:pPr>
-      <w:r>
-        <w:drawing>
-          <wp:inline xmlns:a="http://schemas.openxmlformats.org/drawingml/2006/main" xmlns:pic="http://schemas.openxmlformats.org/drawingml/2006/picture">
-            <wp:extent cx="6492240" cy="2838339"/>
-            <wp:docPr id="5" name="Picture 5"/>
-            <wp:cNvGraphicFramePr>
-              <a:graphicFrameLocks noChangeAspect="1"/>
-            </wp:cNvGraphicFramePr>
-            <a:graphic>
-              <a:graphicData uri="http://schemas.openxmlformats.org/drawingml/2006/picture">
-                <pic:pic>
-                  <pic:nvPicPr>
-                    <pic:cNvPr id="0" name="expected_impacts_heavy_rain.jpg"/>
-                    <pic:cNvPicPr/>
-                  </pic:nvPicPr>
-                  <pic:blipFill>
-                    <a:blip r:embed="rId13"/>
-                    <a:stretch>
-                      <a:fillRect/>
-                    </a:stretch>
-                  </pic:blipFill>
-                  <pic:spPr>
-                    <a:xfrm>
-                      <a:off x="0" y="0"/>
-                      <a:ext cx="6492240" cy="2838339"/>
-                    </a:xfrm>
-                    <a:prstGeom prst="rect"/>
-                  </pic:spPr>
-                </pic:pic>
-              </a:graphicData>
-            </a:graphic>
-          </wp:inline>
-        </w:drawing>
-      </w:r>
-    </w:p>
-    <w:p>
-      <w:pPr>
-        <w:spacing w:before="0" w:after="0"/>
-      </w:pPr>
-      <w:r>
-        <w:br w:type="page"/>
-      </w:r>
-    </w:p>
-    <w:p>
-      <w:pPr>
-        <w:spacing w:before="120" w:after="120" w:line="259" w:lineRule="auto"/>
-        <w:jc w:val="center"/>
-      </w:pPr>
-      <w:r>
-        <w:drawing>
-          <wp:inline xmlns:a="http://schemas.openxmlformats.org/drawingml/2006/main" xmlns:pic="http://schemas.openxmlformats.org/drawingml/2006/picture">
-            <wp:extent cx="6492240" cy="4052959"/>
-            <wp:docPr id="6" name="Picture 6"/>
-            <wp:cNvGraphicFramePr>
-              <a:graphicFrameLocks noChangeAspect="1"/>
-            </wp:cNvGraphicFramePr>
-            <a:graphic>
-              <a:graphicData uri="http://schemas.openxmlformats.org/drawingml/2006/picture">
-                <pic:pic>
-                  <pic:nvPicPr>
-                    <pic:cNvPr id="0" name="expected_impacts_very_severe.jpg"/>
-                    <pic:cNvPicPr/>
-                  </pic:nvPicPr>
-                  <pic:blipFill>
-                    <a:blip r:embed="rId14"/>
-                    <a:stretch>
-                      <a:fillRect/>
-                    </a:stretch>
-                  </pic:blipFill>
-                  <pic:spPr>
-                    <a:xfrm>
-                      <a:off x="0" y="0"/>
-                      <a:ext cx="6492240" cy="4052959"/>
-                    </a:xfrm>
-                    <a:prstGeom prst="rect"/>
-                  </pic:spPr>
-                </pic:pic>
-              </a:graphicData>
-            </a:graphic>
-          </wp:inline>
-        </w:drawing>
-      </w:r>
-    </w:p>
-    <w:p>
-      <w:pPr>
-        <w:spacing w:before="360" w:after="0" w:line="259" w:lineRule="auto"/>
-        <w:jc w:val="right"/>
-      </w:pPr>
-      <w:r>
-        <w:rPr>
-          <w:rFonts w:ascii="Nirmala UI" w:hAnsi="Nirmala UI" w:cs="Nirmala UI" w:eastAsia="Nirmala UI"/>
-          <w:b w:val="0"/>
-          <w:sz w:val="24"/>
-        </w:rPr>
-        <w:t>డ్యూటీ అధికారి / ड्यूटी अधिकारी / Duty Officer</w:t>
+        <w:t>Source: India Meteorological Department | Telangana nowcast products</w:t>
       </w:r>
     </w:p>
     <w:sectPr>
-      <w:pgSz w:w="11906" w:h="16838"/>
-      <w:pgMar w:top="720" w:right="720" w:bottom="720" w:left="720" w:header="720" w:footer="720" w:gutter="0"/>
+      <w:headerReference w:type="default" r:id="rId9"/>
+      <w:pgSz w:w="12240" w:h="15840"/>
+      <w:pgMar w:top="792" w:right="1008" w:bottom="792" w:left="1008" w:header="360" w:footer="720" w:gutter="0"/>
       <w:cols w:space="720"/>
       <w:docGrid w:linePitch="360"/>
     </w:sectPr>
   </w:body>
 </w:document>
+</file>
+
+<file path=word/header1.xml><?xml version="1.0" encoding="utf-8"?>
+<w:hdr xmlns:m="http://schemas.openxmlformats.org/officeDocument/2006/math" xmlns:mc="http://schemas.openxmlformats.org/markup-compatibility/2006" xmlns:mo="http://schemas.microsoft.com/office/mac/office/2008/main" xmlns:mv="urn:schemas-microsoft-com:mac:vml" xmlns:o="urn:schemas-microsoft-com:office:office" xmlns:r="http://schemas.openxmlformats.org/officeDocument/2006/relationships" xmlns:v="urn:schemas-microsoft-com:vml" xmlns:w10="urn:schemas-microsoft-com:office:word" xmlns:w14="http://schemas.microsoft.com/office/word/2010/wordml" xmlns:w="http://schemas.openxmlformats.org/wordprocessingml/2006/main" xmlns:wne="http://schemas.microsoft.com/office/word/2006/wordml" xmlns:wp14="http://schemas.microsoft.com/office/word/2010/wordprocessingDrawing" xmlns:wp="http://schemas.openxmlformats.org/drawingml/2006/wordprocessingDrawing" xmlns:wpc="http://schemas.microsoft.com/office/word/2010/wordprocessingCanvas" xmlns:wpg="http://schemas.microsoft.com/office/word/2010/wordprocessingGroup" xmlns:wpi="http://schemas.microsoft.com/office/word/2010/wordprocessingInk" xmlns:wps="http://schemas.microsoft.com/office/word/2010/wordprocessingShape" mc:Ignorable="w14 wp14">
+  <w:p>
+    <w:pPr>
+      <w:pStyle w:val="Header"/>
+      <w:spacing w:after="0"/>
+      <w:jc w:val="center"/>
+    </w:pPr>
+    <w:r>
+      <w:rPr>
+        <w:rFonts w:ascii="Arial" w:hAnsi="Arial" w:cs="Arial" w:eastAsia="Arial"/>
+        <w:b/>
+        <w:color w:val="0C2F52"/>
+        <w:sz w:val="20"/>
+      </w:rPr>
+      <w:t>INDIA METEOROLOGICAL DEPARTMENT</w:t>
+    </w:r>
+  </w:p>
+</w:hdr>
 </file>
 
 <file path=word/numbering.xml><?xml version="1.0" encoding="utf-8"?>

</xml_diff>